<commit_message>
feat: align quotation order with the shared layout
Co-Authored-By: Claude Sonnet 5.5 <noreply@anthropic.com>
</commit_message>
<xml_diff>
--- a/documents/working/business-stationery-20261027/GEM_Quotation_Proposal_Template_working.docx
+++ b/documents/working/business-stationery-20261027/GEM_Quotation_Proposal_Template_working.docx
@@ -1833,156 +1833,6 @@
                     <w:lang w:val="en-GB"/>
                   </w:rPr>
                   <w:t xml:space="preserve">Enter scope summary</w:t>
-                </w:r>
-              </w:sdtContent>
-            </w:sdt>
-          </w:p>
-        </w:tc>
-      </w:tr>
-    </w:tbl>
-    <w:p>
-      <w:pPr>
-        <w:spacing w:before="0" w:after="0" w:line="20" w:lineRule="exact"/>
-        <w:rPr>
-          <w:sz w:val="2"/>
-          <w:szCs w:val="2"/>
-        </w:rPr>
-      </w:pPr>
-    </w:p>
-    <w:tbl>
-      <w:tblPr>
-        <w:tblW w:w="9072" w:type="dxa"/>
-        <w:tblBorders>
-          <w:top w:val="nil"/>
-          <w:left w:val="nil"/>
-          <w:bottom w:val="nil"/>
-          <w:right w:val="nil"/>
-          <w:insideH w:val="nil"/>
-          <w:insideV w:val="nil"/>
-        </w:tblBorders>
-        <w:tblLayout w:type="fixed"/>
-        <w:tblCellMar>
-          <w:top w:w="40" w:type="dxa"/>
-          <w:left w:w="85" w:type="dxa"/>
-          <w:bottom w:w="40" w:type="dxa"/>
-          <w:right w:w="85" w:type="dxa"/>
-        </w:tblCellMar>
-        <w:tblLook w:firstRow="1" w:lastRow="0" w:firstColumn="0" w:lastColumn="0" w:noHBand="0" w:noVBand="1"/>
-      </w:tblPr>
-      <w:tblGrid>
-        <w:gridCol w:w="5800"/>
-        <w:gridCol w:w="3272"/>
-      </w:tblGrid>
-      <w:tr>
-        <w:trPr>
-          <w:cantSplit/>
-        </w:trPr>
-        <w:tc>
-          <w:tcPr>
-            <w:tcW w:w="5800" w:type="dxa"/>
-            <w:gridSpan w:val="1"/>
-            <w:tcBorders>
-              <w:top w:val="nil"/>
-              <w:left w:val="nil"/>
-              <w:bottom w:val="single" w:sz="8" w:space="0" w:color="BCACA7"/>
-              <w:right w:val="nil"/>
-            </w:tcBorders>
-            <w:vAlign w:val="bottom"/>
-          </w:tcPr>
-          <w:p>
-            <w:pPr>
-              <w:pStyle w:val="Heading1"/>
-              <w:keepNext/>
-              <w:spacing w:before="160" w:after="40" w:line="250" w:lineRule="auto"/>
-              <w:ind w:start="-85"/>
-              <w:jc w:val="left"/>
-            </w:pPr>
-            <w:r>
-              <w:rPr>
-                <w:rFonts w:ascii="Jost" w:hAnsi="Jost" w:eastAsia="Jost" w:cs="Jost"/>
-                <w:color w:val="12171D"/>
-                <w:spacing w:val="34"/>
-                <w:sz w:val="21"/>
-                <w:szCs w:val="21"/>
-                <w:lang w:val="en-GB"/>
-              </w:rPr>
-              <w:t xml:space="preserve">ASSUMPTIONS, EXCLUSIONS &amp; TERMS</w:t>
-            </w:r>
-          </w:p>
-        </w:tc>
-        <w:tc>
-          <w:tcPr>
-            <w:tcW w:w="3272" w:type="dxa"/>
-            <w:gridSpan w:val="1"/>
-            <w:tcBorders>
-              <w:top w:val="nil"/>
-              <w:left w:val="nil"/>
-              <w:bottom w:val="single" w:sz="8" w:space="0" w:color="BCACA7"/>
-              <w:right w:val="nil"/>
-            </w:tcBorders>
-            <w:vAlign w:val="bottom"/>
-          </w:tcPr>
-          <w:p>
-            <w:pPr>
-              <w:keepNext/>
-              <w:bidi w:val="1"/>
-              <w:spacing w:before="160" w:after="40" w:line="250" w:lineRule="auto"/>
-              <w:ind w:start="-85"/>
-              <w:jc w:val="start"/>
-            </w:pPr>
-            <w:r>
-              <w:rPr>
-                <w:rFonts w:ascii="Noto Sans Arabic" w:hAnsi="Noto Sans Arabic" w:eastAsia="Noto Sans Arabic" w:cs="Noto Sans Arabic"/>
-                <w:color w:val="12171D"/>
-                <w:sz w:val="22"/>
-                <w:szCs w:val="22"/>
-                <w:rtl w:val="1"/>
-                <w:lang w:val="ar-SA" w:bidi="ar-SA"/>
-              </w:rPr>
-              <w:t xml:space="preserve">الافتراضات والاستثناءات والشروط</w:t>
-            </w:r>
-          </w:p>
-        </w:tc>
-      </w:tr>
-      <w:tr>
-        <w:trPr>
-          <w:cantSplit/>
-          <w:trHeight w:val="1300" w:hRule="atLeast"/>
-        </w:trPr>
-        <w:tc>
-          <w:tcPr>
-            <w:tcW w:w="9072" w:type="dxa"/>
-            <w:gridSpan w:val="2"/>
-            <w:tcBorders>
-              <w:top w:val="single" w:sz="4" w:space="0" w:color="BCACA7"/>
-              <w:left w:val="single" w:sz="4" w:space="0" w:color="BCACA7"/>
-              <w:bottom w:val="single" w:sz="4" w:space="0" w:color="BCACA7"/>
-              <w:right w:val="single" w:sz="4" w:space="0" w:color="BCACA7"/>
-            </w:tcBorders>
-            <w:vAlign w:val="top"/>
-          </w:tcPr>
-          <w:p>
-            <w:pPr>
-              <w:spacing w:before="0" w:after="40" w:line="288" w:lineRule="exact"/>
-              <w:jc w:val="left"/>
-            </w:pPr>
-            <w:sdt>
-              <w:sdtPr>
-                <w:alias w:val="Assumptions, Exclusions and Terms"/>
-                <w:tag w:val="field_1050"/>
-                <w:id w:val="1050"/>
-                <w:text/>
-              </w:sdtPr>
-              <w:sdtContent>
-                <w:r>
-                  <w:rPr>
-                    <w:rFonts w:ascii="Inter" w:hAnsi="Inter" w:eastAsia="Inter" w:cs="Inter"/>
-                    <w:color w:val="12171D"/>
-                    <w:sz w:val="18"/>
-                    <w:szCs w:val="18"/>
-                    <w:lang w:val="en-GB"/>
-                  </w:rPr>
-                  <w:t xml:space="preserve">Enter assumptions, exclusions and terms</w:t>
                 </w:r>
               </w:sdtContent>
             </w:sdt>
@@ -2428,8 +2278,8 @@
             <w:sdt>
               <w:sdtPr>
                 <w:alias w:val="Description"/>
-                <w:tag w:val="field_1051"/>
-                <w:id w:val="1051"/>
+                <w:tag w:val="field_1050"/>
+                <w:id w:val="1050"/>
                 <w:text/>
               </w:sdtPr>
               <w:sdtContent>
@@ -2464,8 +2314,8 @@
             <w:sdt>
               <w:sdtPr>
                 <w:alias w:val="Qty"/>
-                <w:tag w:val="field_1052"/>
-                <w:id w:val="1052"/>
+                <w:tag w:val="field_1051"/>
+                <w:id w:val="1051"/>
                 <w:text/>
               </w:sdtPr>
               <w:sdtContent>
@@ -2500,8 +2350,8 @@
             <w:sdt>
               <w:sdtPr>
                 <w:alias w:val="Unit"/>
-                <w:tag w:val="field_1053"/>
-                <w:id w:val="1053"/>
+                <w:tag w:val="field_1052"/>
+                <w:id w:val="1052"/>
                 <w:text/>
               </w:sdtPr>
               <w:sdtContent>
@@ -2536,8 +2386,8 @@
             <w:sdt>
               <w:sdtPr>
                 <w:alias w:val="Unit Price"/>
-                <w:tag w:val="field_1054"/>
-                <w:id w:val="1054"/>
+                <w:tag w:val="field_1053"/>
+                <w:id w:val="1053"/>
                 <w:text/>
               </w:sdtPr>
               <w:sdtContent>
@@ -2631,8 +2481,8 @@
             <w:sdt>
               <w:sdtPr>
                 <w:alias w:val="Description"/>
-                <w:tag w:val="field_1055"/>
-                <w:id w:val="1055"/>
+                <w:tag w:val="field_1054"/>
+                <w:id w:val="1054"/>
                 <w:text/>
               </w:sdtPr>
               <w:sdtContent>
@@ -2667,8 +2517,8 @@
             <w:sdt>
               <w:sdtPr>
                 <w:alias w:val="Qty"/>
-                <w:tag w:val="field_1056"/>
-                <w:id w:val="1056"/>
+                <w:tag w:val="field_1055"/>
+                <w:id w:val="1055"/>
                 <w:text/>
               </w:sdtPr>
               <w:sdtContent>
@@ -2703,8 +2553,8 @@
             <w:sdt>
               <w:sdtPr>
                 <w:alias w:val="Unit"/>
-                <w:tag w:val="field_1057"/>
-                <w:id w:val="1057"/>
+                <w:tag w:val="field_1056"/>
+                <w:id w:val="1056"/>
                 <w:text/>
               </w:sdtPr>
               <w:sdtContent>
@@ -2739,8 +2589,8 @@
             <w:sdt>
               <w:sdtPr>
                 <w:alias w:val="Unit Price"/>
-                <w:tag w:val="field_1058"/>
-                <w:id w:val="1058"/>
+                <w:tag w:val="field_1057"/>
+                <w:id w:val="1057"/>
                 <w:text/>
               </w:sdtPr>
               <w:sdtContent>
@@ -2834,8 +2684,8 @@
             <w:sdt>
               <w:sdtPr>
                 <w:alias w:val="Description"/>
-                <w:tag w:val="field_1059"/>
-                <w:id w:val="1059"/>
+                <w:tag w:val="field_1058"/>
+                <w:id w:val="1058"/>
                 <w:text/>
               </w:sdtPr>
               <w:sdtContent>
@@ -2870,8 +2720,8 @@
             <w:sdt>
               <w:sdtPr>
                 <w:alias w:val="Qty"/>
-                <w:tag w:val="field_1060"/>
-                <w:id w:val="1060"/>
+                <w:tag w:val="field_1059"/>
+                <w:id w:val="1059"/>
                 <w:text/>
               </w:sdtPr>
               <w:sdtContent>
@@ -2906,8 +2756,8 @@
             <w:sdt>
               <w:sdtPr>
                 <w:alias w:val="Unit"/>
-                <w:tag w:val="field_1061"/>
-                <w:id w:val="1061"/>
+                <w:tag w:val="field_1060"/>
+                <w:id w:val="1060"/>
                 <w:text/>
               </w:sdtPr>
               <w:sdtContent>
@@ -2942,8 +2792,8 @@
             <w:sdt>
               <w:sdtPr>
                 <w:alias w:val="Unit Price"/>
-                <w:tag w:val="field_1062"/>
-                <w:id w:val="1062"/>
+                <w:tag w:val="field_1061"/>
+                <w:id w:val="1061"/>
                 <w:text/>
               </w:sdtPr>
               <w:sdtContent>
@@ -3037,8 +2887,8 @@
             <w:sdt>
               <w:sdtPr>
                 <w:alias w:val="Description"/>
-                <w:tag w:val="field_1063"/>
-                <w:id w:val="1063"/>
+                <w:tag w:val="field_1062"/>
+                <w:id w:val="1062"/>
                 <w:text/>
               </w:sdtPr>
               <w:sdtContent>
@@ -3073,8 +2923,8 @@
             <w:sdt>
               <w:sdtPr>
                 <w:alias w:val="Qty"/>
-                <w:tag w:val="field_1064"/>
-                <w:id w:val="1064"/>
+                <w:tag w:val="field_1063"/>
+                <w:id w:val="1063"/>
                 <w:text/>
               </w:sdtPr>
               <w:sdtContent>
@@ -3109,8 +2959,8 @@
             <w:sdt>
               <w:sdtPr>
                 <w:alias w:val="Unit"/>
-                <w:tag w:val="field_1065"/>
-                <w:id w:val="1065"/>
+                <w:tag w:val="field_1064"/>
+                <w:id w:val="1064"/>
                 <w:text/>
               </w:sdtPr>
               <w:sdtContent>
@@ -3145,8 +2995,8 @@
             <w:sdt>
               <w:sdtPr>
                 <w:alias w:val="Unit Price"/>
-                <w:tag w:val="field_1066"/>
-                <w:id w:val="1066"/>
+                <w:tag w:val="field_1065"/>
+                <w:id w:val="1065"/>
                 <w:text/>
               </w:sdtPr>
               <w:sdtContent>
@@ -3337,8 +3187,8 @@
             <w:sdt>
               <w:sdtPr>
                 <w:alias w:val="VAT Rate"/>
-                <w:tag w:val="field_1067"/>
-                <w:id w:val="1067"/>
+                <w:tag w:val="field_1066"/>
+                <w:id w:val="1066"/>
                 <w:text/>
               </w:sdtPr>
               <w:sdtContent>
@@ -3512,6 +3362,156 @@
               </w:r>
             </w:fldSimple>
             <w:bookmarkEnd w:id="9021"/>
+          </w:p>
+        </w:tc>
+      </w:tr>
+    </w:tbl>
+    <w:p>
+      <w:pPr>
+        <w:spacing w:before="0" w:after="0" w:line="20" w:lineRule="exact"/>
+        <w:rPr>
+          <w:sz w:val="2"/>
+          <w:szCs w:val="2"/>
+        </w:rPr>
+      </w:pPr>
+    </w:p>
+    <w:tbl>
+      <w:tblPr>
+        <w:tblW w:w="9072" w:type="dxa"/>
+        <w:tblBorders>
+          <w:top w:val="nil"/>
+          <w:left w:val="nil"/>
+          <w:bottom w:val="nil"/>
+          <w:right w:val="nil"/>
+          <w:insideH w:val="nil"/>
+          <w:insideV w:val="nil"/>
+        </w:tblBorders>
+        <w:tblLayout w:type="fixed"/>
+        <w:tblCellMar>
+          <w:top w:w="40" w:type="dxa"/>
+          <w:left w:w="85" w:type="dxa"/>
+          <w:bottom w:w="40" w:type="dxa"/>
+          <w:right w:w="85" w:type="dxa"/>
+        </w:tblCellMar>
+        <w:tblLook w:firstRow="1" w:lastRow="0" w:firstColumn="0" w:lastColumn="0" w:noHBand="0" w:noVBand="1"/>
+      </w:tblPr>
+      <w:tblGrid>
+        <w:gridCol w:w="5800"/>
+        <w:gridCol w:w="3272"/>
+      </w:tblGrid>
+      <w:tr>
+        <w:trPr>
+          <w:cantSplit/>
+        </w:trPr>
+        <w:tc>
+          <w:tcPr>
+            <w:tcW w:w="5800" w:type="dxa"/>
+            <w:gridSpan w:val="1"/>
+            <w:tcBorders>
+              <w:top w:val="nil"/>
+              <w:left w:val="nil"/>
+              <w:bottom w:val="single" w:sz="8" w:space="0" w:color="BCACA7"/>
+              <w:right w:val="nil"/>
+            </w:tcBorders>
+            <w:vAlign w:val="bottom"/>
+          </w:tcPr>
+          <w:p>
+            <w:pPr>
+              <w:pStyle w:val="Heading1"/>
+              <w:keepNext/>
+              <w:spacing w:before="160" w:after="40" w:line="250" w:lineRule="auto"/>
+              <w:ind w:start="-85"/>
+              <w:jc w:val="left"/>
+            </w:pPr>
+            <w:r>
+              <w:rPr>
+                <w:rFonts w:ascii="Jost" w:hAnsi="Jost" w:eastAsia="Jost" w:cs="Jost"/>
+                <w:color w:val="12171D"/>
+                <w:spacing w:val="34"/>
+                <w:sz w:val="21"/>
+                <w:szCs w:val="21"/>
+                <w:lang w:val="en-GB"/>
+              </w:rPr>
+              <w:t xml:space="preserve">ASSUMPTIONS, EXCLUSIONS &amp; TERMS</w:t>
+            </w:r>
+          </w:p>
+        </w:tc>
+        <w:tc>
+          <w:tcPr>
+            <w:tcW w:w="3272" w:type="dxa"/>
+            <w:gridSpan w:val="1"/>
+            <w:tcBorders>
+              <w:top w:val="nil"/>
+              <w:left w:val="nil"/>
+              <w:bottom w:val="single" w:sz="8" w:space="0" w:color="BCACA7"/>
+              <w:right w:val="nil"/>
+            </w:tcBorders>
+            <w:vAlign w:val="bottom"/>
+          </w:tcPr>
+          <w:p>
+            <w:pPr>
+              <w:keepNext/>
+              <w:bidi w:val="1"/>
+              <w:spacing w:before="160" w:after="40" w:line="250" w:lineRule="auto"/>
+              <w:ind w:start="-85"/>
+              <w:jc w:val="start"/>
+            </w:pPr>
+            <w:r>
+              <w:rPr>
+                <w:rFonts w:ascii="Noto Sans Arabic" w:hAnsi="Noto Sans Arabic" w:eastAsia="Noto Sans Arabic" w:cs="Noto Sans Arabic"/>
+                <w:color w:val="12171D"/>
+                <w:sz w:val="22"/>
+                <w:szCs w:val="22"/>
+                <w:rtl w:val="1"/>
+                <w:lang w:val="ar-SA" w:bidi="ar-SA"/>
+              </w:rPr>
+              <w:t xml:space="preserve">الافتراضات والاستثناءات والشروط</w:t>
+            </w:r>
+          </w:p>
+        </w:tc>
+      </w:tr>
+      <w:tr>
+        <w:trPr>
+          <w:cantSplit/>
+          <w:trHeight w:val="1300" w:hRule="atLeast"/>
+        </w:trPr>
+        <w:tc>
+          <w:tcPr>
+            <w:tcW w:w="9072" w:type="dxa"/>
+            <w:gridSpan w:val="2"/>
+            <w:tcBorders>
+              <w:top w:val="single" w:sz="4" w:space="0" w:color="BCACA7"/>
+              <w:left w:val="single" w:sz="4" w:space="0" w:color="BCACA7"/>
+              <w:bottom w:val="single" w:sz="4" w:space="0" w:color="BCACA7"/>
+              <w:right w:val="single" w:sz="4" w:space="0" w:color="BCACA7"/>
+            </w:tcBorders>
+            <w:vAlign w:val="top"/>
+          </w:tcPr>
+          <w:p>
+            <w:pPr>
+              <w:spacing w:before="0" w:after="40" w:line="288" w:lineRule="exact"/>
+              <w:jc w:val="left"/>
+            </w:pPr>
+            <w:sdt>
+              <w:sdtPr>
+                <w:alias w:val="Assumptions, Exclusions and Terms"/>
+                <w:tag w:val="field_1067"/>
+                <w:id w:val="1067"/>
+                <w:text/>
+              </w:sdtPr>
+              <w:sdtContent>
+                <w:r>
+                  <w:rPr>
+                    <w:rFonts w:ascii="Inter" w:hAnsi="Inter" w:eastAsia="Inter" w:cs="Inter"/>
+                    <w:color w:val="12171D"/>
+                    <w:sz w:val="18"/>
+                    <w:szCs w:val="18"/>
+                    <w:lang w:val="en-GB"/>
+                  </w:rPr>
+                  <w:t xml:space="preserve">Enter assumptions, exclusions and terms</w:t>
+                </w:r>
+              </w:sdtContent>
+            </w:sdt>
           </w:p>
         </w:tc>
       </w:tr>

</xml_diff>